<commit_message>
Reformula roteiros de Reels do calendario de setembro em blocos TRECHO
Adiciona suporte a lista de "trechos" numerados no gerador de PDF/DOCX
(build-lib.py e build-docx.py), reproduzindo o mesmo formato de roteiro
por blocos usado no calendario de agosto, mais facil de ler/usar no
teleprompter do que um paragrafo unico.

Co-Authored-By: Claude Sonnet 5 <noreply@anthropic.com>
Claude-Session: https://claude.ai/code/session_01WSt3GY1qD8uPk293jNa2cE
</commit_message>
<xml_diff>
--- a/camila-sartori/calendario-fonte/calendario-instagram-setembro.docx
+++ b/camila-sartori/calendario-fonte/calendario-instagram-setembro.docx
@@ -205,7 +205,7 @@
           </w:p>
           <w:p>
             <w:pPr>
-              <w:spacing w:after="100"/>
+              <w:spacing w:after="80"/>
             </w:pPr>
             <w:r>
               <w:rPr>
@@ -213,7 +213,31 @@
                 <w:i w:val="0"/>
                 <w:sz w:val="19"/>
               </w:rPr>
-              <w:t xml:space="preserve">SUBHEADLINE: </w:t>
+              <w:t>ROTEIRO (teleprompter):</w:t>
+            </w:r>
+          </w:p>
+          <w:p>
+            <w:pPr>
+              <w:spacing w:after="160" w:before="40"/>
+              <w:shd w:val="clear" w:fill="FBEEF7"/>
+              <w:pBdr>
+                <w:top w:val="single" w:sz="6" w:space="4" w:color="D9D9D9"/>
+                <w:left w:val="single" w:sz="6" w:space="4" w:color="D9D9D9"/>
+                <w:bottom w:val="single" w:sz="6" w:space="4" w:color="D9D9D9"/>
+                <w:right w:val="single" w:sz="6" w:space="4" w:color="D9D9D9"/>
+              </w:pBdr>
+            </w:pPr>
+            <w:r>
+              <w:rPr>
+                <w:b/>
+                <w:i w:val="0"/>
+                <w:color w:val="666666"/>
+                <w:sz w:val="18"/>
+              </w:rPr>
+              <w:t>TRECHO 1</w:t>
+            </w:r>
+            <w:r>
+              <w:br/>
             </w:r>
             <w:r>
               <w:rPr>
@@ -221,7 +245,231 @@
                 <w:i w:val="0"/>
                 <w:sz w:val="19"/>
               </w:rPr>
-              <w:t>Roteiro completo (teleprompter): "Ele nunca gritou, nunca apelou para violência física, e mesmo assim, com o tempo, ela foi se sentindo cada vez mais invalidada perto dele. No começo, era tudo perfeito. Atenção, elogios, aquela sensação de ter encontrado alguém raro. Só que, aos poucos, os elogios viraram comparações. As brincadeiras viraram indiretas. E ela começou a se policiar antes de falar, de rir, de se vestir. Isso tem nome, em psicologia: é um padrão de idealização seguido de desvalorização, muito comum em relações que começam intensas demais. O problema é que, como não teve um estopim, uma briga feia, uma traição óbvia, fica muito difícil nomear o que está acontecendo. A pessoa só sente que não é mais a mesma e não sabe dizer por quê. Na terapia, a gente trabalha exatamente isso: identificar os sinais mais sutis, antes que a autoestima seja corroída aos poucos, sem um motivo grande o suficiente pra justificar. Porque relacionamento tóxico nem sempre grita. Às vezes ele sussurra, dia após dia, até a pessoa esquecer como era antes, e como ela se sentia segura e possivelmente não se sente mais. Eu sou Camila Sartori, psicóloga, e trabalho com terapia do esquema e terapia cognitivo-comportamental, ajudando mulheres a reconhecerem esses padrões antes que eles custem caro demais."</w:t>
+              <w:t>Ele nunca gritou, nunca apelou para violência física, e mesmo assim, com o tempo, ela foi se sentindo cada vez mais invalidada perto dele.</w:t>
+            </w:r>
+          </w:p>
+          <w:p>
+            <w:pPr>
+              <w:spacing w:after="160" w:before="40"/>
+              <w:shd w:val="clear" w:fill="FBEEF7"/>
+              <w:pBdr>
+                <w:top w:val="single" w:sz="6" w:space="4" w:color="D9D9D9"/>
+                <w:left w:val="single" w:sz="6" w:space="4" w:color="D9D9D9"/>
+                <w:bottom w:val="single" w:sz="6" w:space="4" w:color="D9D9D9"/>
+                <w:right w:val="single" w:sz="6" w:space="4" w:color="D9D9D9"/>
+              </w:pBdr>
+            </w:pPr>
+            <w:r>
+              <w:rPr>
+                <w:b/>
+                <w:i w:val="0"/>
+                <w:color w:val="666666"/>
+                <w:sz w:val="18"/>
+              </w:rPr>
+              <w:t>TRECHO 2</w:t>
+            </w:r>
+            <w:r>
+              <w:br/>
+            </w:r>
+            <w:r>
+              <w:rPr>
+                <w:b w:val="0"/>
+                <w:i w:val="0"/>
+                <w:sz w:val="19"/>
+              </w:rPr>
+              <w:t>No começo, era tudo perfeito. Atenção, elogios, aquela sensação de ter encontrado alguém raro.</w:t>
+            </w:r>
+          </w:p>
+          <w:p>
+            <w:pPr>
+              <w:spacing w:after="160" w:before="40"/>
+              <w:shd w:val="clear" w:fill="FBEEF7"/>
+              <w:pBdr>
+                <w:top w:val="single" w:sz="6" w:space="4" w:color="D9D9D9"/>
+                <w:left w:val="single" w:sz="6" w:space="4" w:color="D9D9D9"/>
+                <w:bottom w:val="single" w:sz="6" w:space="4" w:color="D9D9D9"/>
+                <w:right w:val="single" w:sz="6" w:space="4" w:color="D9D9D9"/>
+              </w:pBdr>
+            </w:pPr>
+            <w:r>
+              <w:rPr>
+                <w:b/>
+                <w:i w:val="0"/>
+                <w:color w:val="666666"/>
+                <w:sz w:val="18"/>
+              </w:rPr>
+              <w:t>TRECHO 3</w:t>
+            </w:r>
+            <w:r>
+              <w:br/>
+            </w:r>
+            <w:r>
+              <w:rPr>
+                <w:b w:val="0"/>
+                <w:i w:val="0"/>
+                <w:sz w:val="19"/>
+              </w:rPr>
+              <w:t>Só que, aos poucos, os elogios viraram comparações. As brincadeiras viraram indiretas. E ela começou a se policiar antes de falar, de rir, de se vestir.</w:t>
+            </w:r>
+          </w:p>
+          <w:p>
+            <w:pPr>
+              <w:spacing w:after="160" w:before="40"/>
+              <w:shd w:val="clear" w:fill="FBEEF7"/>
+              <w:pBdr>
+                <w:top w:val="single" w:sz="6" w:space="4" w:color="D9D9D9"/>
+                <w:left w:val="single" w:sz="6" w:space="4" w:color="D9D9D9"/>
+                <w:bottom w:val="single" w:sz="6" w:space="4" w:color="D9D9D9"/>
+                <w:right w:val="single" w:sz="6" w:space="4" w:color="D9D9D9"/>
+              </w:pBdr>
+            </w:pPr>
+            <w:r>
+              <w:rPr>
+                <w:b/>
+                <w:i w:val="0"/>
+                <w:color w:val="666666"/>
+                <w:sz w:val="18"/>
+              </w:rPr>
+              <w:t>TRECHO 4</w:t>
+            </w:r>
+            <w:r>
+              <w:br/>
+            </w:r>
+            <w:r>
+              <w:rPr>
+                <w:b w:val="0"/>
+                <w:i w:val="0"/>
+                <w:sz w:val="19"/>
+              </w:rPr>
+              <w:t>Isso tem nome, em psicologia: é um padrão de idealização seguido de desvalorização, muito comum em relações que começam intensas demais.</w:t>
+            </w:r>
+          </w:p>
+          <w:p>
+            <w:pPr>
+              <w:spacing w:after="160" w:before="40"/>
+              <w:shd w:val="clear" w:fill="FBEEF7"/>
+              <w:pBdr>
+                <w:top w:val="single" w:sz="6" w:space="4" w:color="D9D9D9"/>
+                <w:left w:val="single" w:sz="6" w:space="4" w:color="D9D9D9"/>
+                <w:bottom w:val="single" w:sz="6" w:space="4" w:color="D9D9D9"/>
+                <w:right w:val="single" w:sz="6" w:space="4" w:color="D9D9D9"/>
+              </w:pBdr>
+            </w:pPr>
+            <w:r>
+              <w:rPr>
+                <w:b/>
+                <w:i w:val="0"/>
+                <w:color w:val="666666"/>
+                <w:sz w:val="18"/>
+              </w:rPr>
+              <w:t>TRECHO 5</w:t>
+            </w:r>
+            <w:r>
+              <w:br/>
+            </w:r>
+            <w:r>
+              <w:rPr>
+                <w:b w:val="0"/>
+                <w:i w:val="0"/>
+                <w:sz w:val="19"/>
+              </w:rPr>
+              <w:t>O problema é que, como não teve um estopim, uma briga feia, uma traição óbvia, fica muito difícil nomear o que está acontecendo. A pessoa só sente que não é mais a mesma e não sabe dizer por quê.</w:t>
+            </w:r>
+          </w:p>
+          <w:p>
+            <w:pPr>
+              <w:spacing w:after="160" w:before="40"/>
+              <w:shd w:val="clear" w:fill="FBEEF7"/>
+              <w:pBdr>
+                <w:top w:val="single" w:sz="6" w:space="4" w:color="D9D9D9"/>
+                <w:left w:val="single" w:sz="6" w:space="4" w:color="D9D9D9"/>
+                <w:bottom w:val="single" w:sz="6" w:space="4" w:color="D9D9D9"/>
+                <w:right w:val="single" w:sz="6" w:space="4" w:color="D9D9D9"/>
+              </w:pBdr>
+            </w:pPr>
+            <w:r>
+              <w:rPr>
+                <w:b/>
+                <w:i w:val="0"/>
+                <w:color w:val="666666"/>
+                <w:sz w:val="18"/>
+              </w:rPr>
+              <w:t>TRECHO 6</w:t>
+            </w:r>
+            <w:r>
+              <w:br/>
+            </w:r>
+            <w:r>
+              <w:rPr>
+                <w:b w:val="0"/>
+                <w:i w:val="0"/>
+                <w:sz w:val="19"/>
+              </w:rPr>
+              <w:t>Na terapia, a gente trabalha exatamente isso: identificar os sinais mais sutis, antes que a autoestima seja corroída aos poucos, sem um motivo grande o suficiente pra justificar.</w:t>
+            </w:r>
+          </w:p>
+          <w:p>
+            <w:pPr>
+              <w:spacing w:after="160" w:before="40"/>
+              <w:shd w:val="clear" w:fill="FBEEF7"/>
+              <w:pBdr>
+                <w:top w:val="single" w:sz="6" w:space="4" w:color="D9D9D9"/>
+                <w:left w:val="single" w:sz="6" w:space="4" w:color="D9D9D9"/>
+                <w:bottom w:val="single" w:sz="6" w:space="4" w:color="D9D9D9"/>
+                <w:right w:val="single" w:sz="6" w:space="4" w:color="D9D9D9"/>
+              </w:pBdr>
+            </w:pPr>
+            <w:r>
+              <w:rPr>
+                <w:b/>
+                <w:i w:val="0"/>
+                <w:color w:val="666666"/>
+                <w:sz w:val="18"/>
+              </w:rPr>
+              <w:t>TRECHO 7</w:t>
+            </w:r>
+            <w:r>
+              <w:br/>
+            </w:r>
+            <w:r>
+              <w:rPr>
+                <w:b w:val="0"/>
+                <w:i w:val="0"/>
+                <w:sz w:val="19"/>
+              </w:rPr>
+              <w:t>Porque relacionamento tóxico nem sempre grita. Às vezes ele sussurra, dia após dia, até a pessoa esquecer como era antes, e como ela se sentia segura e possivelmente não se sente mais.</w:t>
+            </w:r>
+          </w:p>
+          <w:p>
+            <w:pPr>
+              <w:spacing w:after="160" w:before="40"/>
+              <w:shd w:val="clear" w:fill="FBEEF7"/>
+              <w:pBdr>
+                <w:top w:val="single" w:sz="6" w:space="4" w:color="D9D9D9"/>
+                <w:left w:val="single" w:sz="6" w:space="4" w:color="D9D9D9"/>
+                <w:bottom w:val="single" w:sz="6" w:space="4" w:color="D9D9D9"/>
+                <w:right w:val="single" w:sz="6" w:space="4" w:color="D9D9D9"/>
+              </w:pBdr>
+            </w:pPr>
+            <w:r>
+              <w:rPr>
+                <w:b/>
+                <w:i w:val="0"/>
+                <w:color w:val="666666"/>
+                <w:sz w:val="18"/>
+              </w:rPr>
+              <w:t>TRECHO 8</w:t>
+            </w:r>
+            <w:r>
+              <w:br/>
+            </w:r>
+            <w:r>
+              <w:rPr>
+                <w:b w:val="0"/>
+                <w:i w:val="0"/>
+                <w:sz w:val="19"/>
+              </w:rPr>
+              <w:t>Eu sou Camila Sartori, psicóloga, e trabalho com terapia do esquema e terapia cognitivo-comportamental, ajudando mulheres a reconhecerem esses padrões antes que eles custem caro demais.</w:t>
             </w:r>
           </w:p>
           <w:p>
@@ -477,7 +725,7 @@
           </w:p>
           <w:p>
             <w:pPr>
-              <w:spacing w:after="100"/>
+              <w:spacing w:after="80"/>
             </w:pPr>
             <w:r>
               <w:rPr>
@@ -485,7 +733,31 @@
                 <w:i w:val="0"/>
                 <w:sz w:val="19"/>
               </w:rPr>
-              <w:t xml:space="preserve">SUBHEADLINE: </w:t>
+              <w:t>ROTEIRO (teleprompter):</w:t>
+            </w:r>
+          </w:p>
+          <w:p>
+            <w:pPr>
+              <w:spacing w:after="160" w:before="40"/>
+              <w:shd w:val="clear" w:fill="FBEEF7"/>
+              <w:pBdr>
+                <w:top w:val="single" w:sz="6" w:space="4" w:color="D9D9D9"/>
+                <w:left w:val="single" w:sz="6" w:space="4" w:color="D9D9D9"/>
+                <w:bottom w:val="single" w:sz="6" w:space="4" w:color="D9D9D9"/>
+                <w:right w:val="single" w:sz="6" w:space="4" w:color="D9D9D9"/>
+              </w:pBdr>
+            </w:pPr>
+            <w:r>
+              <w:rPr>
+                <w:b/>
+                <w:i w:val="0"/>
+                <w:color w:val="666666"/>
+                <w:sz w:val="18"/>
+              </w:rPr>
+              <w:t>TRECHO 1</w:t>
+            </w:r>
+            <w:r>
+              <w:br/>
             </w:r>
             <w:r>
               <w:rPr>
@@ -493,7 +765,199 @@
                 <w:i w:val="0"/>
                 <w:sz w:val="19"/>
               </w:rPr>
-              <w:t>Roteiro completo (teleprompter): "Por que você sempre se sabota da mesma forma? No amor, no trabalho, com você mesma. Você começa uma dieta e desiste na primeira semana. Começa a conhecer alguém legal e já procura defeito. Recebe uma oportunidade boa e acha que não merece. Isso não é falta de força de vontade. É um padrão, um jeito automático de reagir que a mente aprendeu em algum momento, e que se repete até hoje sem você perceber. A autossabotagem geralmente nasce como proteção: se eu desisto antes, eu não me frustro depois. Se eu não me permito querer, eu não corro o risco de perder. Só que essa proteção tem um preço: ela te afasta exatamente do que você mais quer construir, seja um relacionamento saudável, uma carreira, ou se sentir bem com você mesma. A boa notícia é que, assim como foi aprendido, esse padrão pode ser desconstruído, entendendo a raiz dele, não só tentando ter mais disciplina. Eu criei um espaço gratuito pra isso: o Grupo VIP, exclusivo para mulheres, onde toda semana eu falo sobre autoconhecimento, crenças limitantes, ciúmes, relacionamentos mais saudáveis, autoestima e qualidade de vida."</w:t>
+              <w:t>Por que você sempre se sabota da mesma forma? No amor, no trabalho, com você mesma.</w:t>
+            </w:r>
+          </w:p>
+          <w:p>
+            <w:pPr>
+              <w:spacing w:after="160" w:before="40"/>
+              <w:shd w:val="clear" w:fill="FBEEF7"/>
+              <w:pBdr>
+                <w:top w:val="single" w:sz="6" w:space="4" w:color="D9D9D9"/>
+                <w:left w:val="single" w:sz="6" w:space="4" w:color="D9D9D9"/>
+                <w:bottom w:val="single" w:sz="6" w:space="4" w:color="D9D9D9"/>
+                <w:right w:val="single" w:sz="6" w:space="4" w:color="D9D9D9"/>
+              </w:pBdr>
+            </w:pPr>
+            <w:r>
+              <w:rPr>
+                <w:b/>
+                <w:i w:val="0"/>
+                <w:color w:val="666666"/>
+                <w:sz w:val="18"/>
+              </w:rPr>
+              <w:t>TRECHO 2</w:t>
+            </w:r>
+            <w:r>
+              <w:br/>
+            </w:r>
+            <w:r>
+              <w:rPr>
+                <w:b w:val="0"/>
+                <w:i w:val="0"/>
+                <w:sz w:val="19"/>
+              </w:rPr>
+              <w:t>Você começa uma dieta e desiste na primeira semana. Começa a conhecer alguém legal e já procura defeito. Recebe uma oportunidade boa e acha que não merece.</w:t>
+            </w:r>
+          </w:p>
+          <w:p>
+            <w:pPr>
+              <w:spacing w:after="160" w:before="40"/>
+              <w:shd w:val="clear" w:fill="FBEEF7"/>
+              <w:pBdr>
+                <w:top w:val="single" w:sz="6" w:space="4" w:color="D9D9D9"/>
+                <w:left w:val="single" w:sz="6" w:space="4" w:color="D9D9D9"/>
+                <w:bottom w:val="single" w:sz="6" w:space="4" w:color="D9D9D9"/>
+                <w:right w:val="single" w:sz="6" w:space="4" w:color="D9D9D9"/>
+              </w:pBdr>
+            </w:pPr>
+            <w:r>
+              <w:rPr>
+                <w:b/>
+                <w:i w:val="0"/>
+                <w:color w:val="666666"/>
+                <w:sz w:val="18"/>
+              </w:rPr>
+              <w:t>TRECHO 3</w:t>
+            </w:r>
+            <w:r>
+              <w:br/>
+            </w:r>
+            <w:r>
+              <w:rPr>
+                <w:b w:val="0"/>
+                <w:i w:val="0"/>
+                <w:sz w:val="19"/>
+              </w:rPr>
+              <w:t>Isso não é falta de força de vontade. É um padrão, um jeito automático de reagir que a mente aprendeu em algum momento, e que se repete até hoje sem você perceber.</w:t>
+            </w:r>
+          </w:p>
+          <w:p>
+            <w:pPr>
+              <w:spacing w:after="160" w:before="40"/>
+              <w:shd w:val="clear" w:fill="FBEEF7"/>
+              <w:pBdr>
+                <w:top w:val="single" w:sz="6" w:space="4" w:color="D9D9D9"/>
+                <w:left w:val="single" w:sz="6" w:space="4" w:color="D9D9D9"/>
+                <w:bottom w:val="single" w:sz="6" w:space="4" w:color="D9D9D9"/>
+                <w:right w:val="single" w:sz="6" w:space="4" w:color="D9D9D9"/>
+              </w:pBdr>
+            </w:pPr>
+            <w:r>
+              <w:rPr>
+                <w:b/>
+                <w:i w:val="0"/>
+                <w:color w:val="666666"/>
+                <w:sz w:val="18"/>
+              </w:rPr>
+              <w:t>TRECHO 4</w:t>
+            </w:r>
+            <w:r>
+              <w:br/>
+            </w:r>
+            <w:r>
+              <w:rPr>
+                <w:b w:val="0"/>
+                <w:i w:val="0"/>
+                <w:sz w:val="19"/>
+              </w:rPr>
+              <w:t>A autossabotagem geralmente nasce como proteção: se eu desisto antes, eu não me frustro depois. Se eu não me permito querer, eu não corro o risco de perder.</w:t>
+            </w:r>
+          </w:p>
+          <w:p>
+            <w:pPr>
+              <w:spacing w:after="160" w:before="40"/>
+              <w:shd w:val="clear" w:fill="FBEEF7"/>
+              <w:pBdr>
+                <w:top w:val="single" w:sz="6" w:space="4" w:color="D9D9D9"/>
+                <w:left w:val="single" w:sz="6" w:space="4" w:color="D9D9D9"/>
+                <w:bottom w:val="single" w:sz="6" w:space="4" w:color="D9D9D9"/>
+                <w:right w:val="single" w:sz="6" w:space="4" w:color="D9D9D9"/>
+              </w:pBdr>
+            </w:pPr>
+            <w:r>
+              <w:rPr>
+                <w:b/>
+                <w:i w:val="0"/>
+                <w:color w:val="666666"/>
+                <w:sz w:val="18"/>
+              </w:rPr>
+              <w:t>TRECHO 5</w:t>
+            </w:r>
+            <w:r>
+              <w:br/>
+            </w:r>
+            <w:r>
+              <w:rPr>
+                <w:b w:val="0"/>
+                <w:i w:val="0"/>
+                <w:sz w:val="19"/>
+              </w:rPr>
+              <w:t>Só que essa proteção tem um preço: ela te afasta exatamente do que você mais quer construir, seja um relacionamento saudável, uma carreira, ou se sentir bem com você mesma.</w:t>
+            </w:r>
+          </w:p>
+          <w:p>
+            <w:pPr>
+              <w:spacing w:after="160" w:before="40"/>
+              <w:shd w:val="clear" w:fill="FBEEF7"/>
+              <w:pBdr>
+                <w:top w:val="single" w:sz="6" w:space="4" w:color="D9D9D9"/>
+                <w:left w:val="single" w:sz="6" w:space="4" w:color="D9D9D9"/>
+                <w:bottom w:val="single" w:sz="6" w:space="4" w:color="D9D9D9"/>
+                <w:right w:val="single" w:sz="6" w:space="4" w:color="D9D9D9"/>
+              </w:pBdr>
+            </w:pPr>
+            <w:r>
+              <w:rPr>
+                <w:b/>
+                <w:i w:val="0"/>
+                <w:color w:val="666666"/>
+                <w:sz w:val="18"/>
+              </w:rPr>
+              <w:t>TRECHO 6</w:t>
+            </w:r>
+            <w:r>
+              <w:br/>
+            </w:r>
+            <w:r>
+              <w:rPr>
+                <w:b w:val="0"/>
+                <w:i w:val="0"/>
+                <w:sz w:val="19"/>
+              </w:rPr>
+              <w:t>A boa notícia é que, assim como foi aprendido, esse padrão pode ser desconstruído, entendendo a raiz dele, não só tentando ter mais disciplina.</w:t>
+            </w:r>
+          </w:p>
+          <w:p>
+            <w:pPr>
+              <w:spacing w:after="160" w:before="40"/>
+              <w:shd w:val="clear" w:fill="FBEEF7"/>
+              <w:pBdr>
+                <w:top w:val="single" w:sz="6" w:space="4" w:color="D9D9D9"/>
+                <w:left w:val="single" w:sz="6" w:space="4" w:color="D9D9D9"/>
+                <w:bottom w:val="single" w:sz="6" w:space="4" w:color="D9D9D9"/>
+                <w:right w:val="single" w:sz="6" w:space="4" w:color="D9D9D9"/>
+              </w:pBdr>
+            </w:pPr>
+            <w:r>
+              <w:rPr>
+                <w:b/>
+                <w:i w:val="0"/>
+                <w:color w:val="666666"/>
+                <w:sz w:val="18"/>
+              </w:rPr>
+              <w:t>TRECHO 7</w:t>
+            </w:r>
+            <w:r>
+              <w:br/>
+            </w:r>
+            <w:r>
+              <w:rPr>
+                <w:b w:val="0"/>
+                <w:i w:val="0"/>
+                <w:sz w:val="19"/>
+              </w:rPr>
+              <w:t>Eu criei um espaço gratuito pra isso: o Grupo VIP, exclusivo para mulheres, onde toda semana eu falo sobre autoconhecimento, crenças limitantes, ciúmes, relacionamentos mais saudáveis, autoestima e qualidade de vida.</w:t>
             </w:r>
           </w:p>
           <w:p>
@@ -783,7 +1247,7 @@
           </w:p>
           <w:p>
             <w:pPr>
-              <w:spacing w:after="100"/>
+              <w:spacing w:after="80"/>
             </w:pPr>
             <w:r>
               <w:rPr>
@@ -791,7 +1255,31 @@
                 <w:i w:val="0"/>
                 <w:sz w:val="19"/>
               </w:rPr>
-              <w:t xml:space="preserve">SUBHEADLINE: </w:t>
+              <w:t>ROTEIRO (teleprompter):</w:t>
+            </w:r>
+          </w:p>
+          <w:p>
+            <w:pPr>
+              <w:spacing w:after="160" w:before="40"/>
+              <w:shd w:val="clear" w:fill="FBEEF7"/>
+              <w:pBdr>
+                <w:top w:val="single" w:sz="6" w:space="4" w:color="D9D9D9"/>
+                <w:left w:val="single" w:sz="6" w:space="4" w:color="D9D9D9"/>
+                <w:bottom w:val="single" w:sz="6" w:space="4" w:color="D9D9D9"/>
+                <w:right w:val="single" w:sz="6" w:space="4" w:color="D9D9D9"/>
+              </w:pBdr>
+            </w:pPr>
+            <w:r>
+              <w:rPr>
+                <w:b/>
+                <w:i w:val="0"/>
+                <w:color w:val="666666"/>
+                <w:sz w:val="18"/>
+              </w:rPr>
+              <w:t>TRECHO 1</w:t>
+            </w:r>
+            <w:r>
+              <w:br/>
             </w:r>
             <w:r>
               <w:rPr>
@@ -799,7 +1287,199 @@
                 <w:i w:val="0"/>
                 <w:sz w:val="19"/>
               </w:rPr>
-              <w:t>Roteiro completo (teleprompter): "Ele nunca levantou a mão pra ela. Mas toda vez que ela falava alguma coisa, ele fazia questão de mostrar que a opinião dela não valia nada. Você está exagerando. Isso não foi bem assim. Você é sensível demais. Frase depois de frase, pequena, quase inofensiva sozinha. Só que, juntas, repetidas semana após semana, elas vão fazendo a pessoa duvidar da própria percepção da realidade. Isso tem nome: invalidação emocional, um tipo de abuso verbal que raramente é reconhecido como abuso. A gente aprendeu a associar relacionamento abusivo só à violência física. Mas existe uma violência que não deixa marca visível, e é exatamente por isso que ela é tão difícil de nomear, e tão fácil de normalizar. Quando alguém repetidamente diminui o que você sente, ridiculariza suas reações, ou faz você se desculpar por coisas que nem foram erradas, isso corrói a autoestima de um jeito silencioso e cumulativo. Em terapia, a gente trabalha reconstruir essa capacidade de confiar na própria percepção, de voltar a validar o que se sente, sem precisar da aprovação de ninguém pra isso ser real. Reconhecer isso não é procurar defeito no relacionamento, é dar a si mesma o direito de sentir o que sente sem precisar justificar."</w:t>
+              <w:t>Ele nunca levantou a mão pra ela. Mas toda vez que ela falava alguma coisa, ele fazia questão de mostrar que a opinião dela não valia nada.</w:t>
+            </w:r>
+          </w:p>
+          <w:p>
+            <w:pPr>
+              <w:spacing w:after="160" w:before="40"/>
+              <w:shd w:val="clear" w:fill="FBEEF7"/>
+              <w:pBdr>
+                <w:top w:val="single" w:sz="6" w:space="4" w:color="D9D9D9"/>
+                <w:left w:val="single" w:sz="6" w:space="4" w:color="D9D9D9"/>
+                <w:bottom w:val="single" w:sz="6" w:space="4" w:color="D9D9D9"/>
+                <w:right w:val="single" w:sz="6" w:space="4" w:color="D9D9D9"/>
+              </w:pBdr>
+            </w:pPr>
+            <w:r>
+              <w:rPr>
+                <w:b/>
+                <w:i w:val="0"/>
+                <w:color w:val="666666"/>
+                <w:sz w:val="18"/>
+              </w:rPr>
+              <w:t>TRECHO 2</w:t>
+            </w:r>
+            <w:r>
+              <w:br/>
+            </w:r>
+            <w:r>
+              <w:rPr>
+                <w:b w:val="0"/>
+                <w:i w:val="0"/>
+                <w:sz w:val="19"/>
+              </w:rPr>
+              <w:t>Você está exagerando. Isso não foi bem assim. Você é sensível demais. Frase depois de frase, pequena, quase inofensiva sozinha.</w:t>
+            </w:r>
+          </w:p>
+          <w:p>
+            <w:pPr>
+              <w:spacing w:after="160" w:before="40"/>
+              <w:shd w:val="clear" w:fill="FBEEF7"/>
+              <w:pBdr>
+                <w:top w:val="single" w:sz="6" w:space="4" w:color="D9D9D9"/>
+                <w:left w:val="single" w:sz="6" w:space="4" w:color="D9D9D9"/>
+                <w:bottom w:val="single" w:sz="6" w:space="4" w:color="D9D9D9"/>
+                <w:right w:val="single" w:sz="6" w:space="4" w:color="D9D9D9"/>
+              </w:pBdr>
+            </w:pPr>
+            <w:r>
+              <w:rPr>
+                <w:b/>
+                <w:i w:val="0"/>
+                <w:color w:val="666666"/>
+                <w:sz w:val="18"/>
+              </w:rPr>
+              <w:t>TRECHO 3</w:t>
+            </w:r>
+            <w:r>
+              <w:br/>
+            </w:r>
+            <w:r>
+              <w:rPr>
+                <w:b w:val="0"/>
+                <w:i w:val="0"/>
+                <w:sz w:val="19"/>
+              </w:rPr>
+              <w:t>Só que, juntas, repetidas semana após semana, elas vão fazendo a pessoa duvidar da própria percepção da realidade. Isso tem nome: invalidação emocional, um tipo de abuso verbal que raramente é reconhecido como abuso.</w:t>
+            </w:r>
+          </w:p>
+          <w:p>
+            <w:pPr>
+              <w:spacing w:after="160" w:before="40"/>
+              <w:shd w:val="clear" w:fill="FBEEF7"/>
+              <w:pBdr>
+                <w:top w:val="single" w:sz="6" w:space="4" w:color="D9D9D9"/>
+                <w:left w:val="single" w:sz="6" w:space="4" w:color="D9D9D9"/>
+                <w:bottom w:val="single" w:sz="6" w:space="4" w:color="D9D9D9"/>
+                <w:right w:val="single" w:sz="6" w:space="4" w:color="D9D9D9"/>
+              </w:pBdr>
+            </w:pPr>
+            <w:r>
+              <w:rPr>
+                <w:b/>
+                <w:i w:val="0"/>
+                <w:color w:val="666666"/>
+                <w:sz w:val="18"/>
+              </w:rPr>
+              <w:t>TRECHO 4</w:t>
+            </w:r>
+            <w:r>
+              <w:br/>
+            </w:r>
+            <w:r>
+              <w:rPr>
+                <w:b w:val="0"/>
+                <w:i w:val="0"/>
+                <w:sz w:val="19"/>
+              </w:rPr>
+              <w:t>A gente aprendeu a associar relacionamento abusivo só à violência física. Mas existe uma violência que não deixa marca visível, e é exatamente por isso que ela é tão difícil de nomear, e tão fácil de normalizar.</w:t>
+            </w:r>
+          </w:p>
+          <w:p>
+            <w:pPr>
+              <w:spacing w:after="160" w:before="40"/>
+              <w:shd w:val="clear" w:fill="FBEEF7"/>
+              <w:pBdr>
+                <w:top w:val="single" w:sz="6" w:space="4" w:color="D9D9D9"/>
+                <w:left w:val="single" w:sz="6" w:space="4" w:color="D9D9D9"/>
+                <w:bottom w:val="single" w:sz="6" w:space="4" w:color="D9D9D9"/>
+                <w:right w:val="single" w:sz="6" w:space="4" w:color="D9D9D9"/>
+              </w:pBdr>
+            </w:pPr>
+            <w:r>
+              <w:rPr>
+                <w:b/>
+                <w:i w:val="0"/>
+                <w:color w:val="666666"/>
+                <w:sz w:val="18"/>
+              </w:rPr>
+              <w:t>TRECHO 5</w:t>
+            </w:r>
+            <w:r>
+              <w:br/>
+            </w:r>
+            <w:r>
+              <w:rPr>
+                <w:b w:val="0"/>
+                <w:i w:val="0"/>
+                <w:sz w:val="19"/>
+              </w:rPr>
+              <w:t>Quando alguém repetidamente diminui o que você sente, ridiculariza suas reações, ou faz você se desculpar por coisas que nem foram erradas, isso corrói a autoestima de um jeito silencioso e cumulativo.</w:t>
+            </w:r>
+          </w:p>
+          <w:p>
+            <w:pPr>
+              <w:spacing w:after="160" w:before="40"/>
+              <w:shd w:val="clear" w:fill="FBEEF7"/>
+              <w:pBdr>
+                <w:top w:val="single" w:sz="6" w:space="4" w:color="D9D9D9"/>
+                <w:left w:val="single" w:sz="6" w:space="4" w:color="D9D9D9"/>
+                <w:bottom w:val="single" w:sz="6" w:space="4" w:color="D9D9D9"/>
+                <w:right w:val="single" w:sz="6" w:space="4" w:color="D9D9D9"/>
+              </w:pBdr>
+            </w:pPr>
+            <w:r>
+              <w:rPr>
+                <w:b/>
+                <w:i w:val="0"/>
+                <w:color w:val="666666"/>
+                <w:sz w:val="18"/>
+              </w:rPr>
+              <w:t>TRECHO 6</w:t>
+            </w:r>
+            <w:r>
+              <w:br/>
+            </w:r>
+            <w:r>
+              <w:rPr>
+                <w:b w:val="0"/>
+                <w:i w:val="0"/>
+                <w:sz w:val="19"/>
+              </w:rPr>
+              <w:t>Em terapia, a gente trabalha reconstruir essa capacidade de confiar na própria percepção, de voltar a validar o que se sente, sem precisar da aprovação de ninguém pra isso ser real.</w:t>
+            </w:r>
+          </w:p>
+          <w:p>
+            <w:pPr>
+              <w:spacing w:after="160" w:before="40"/>
+              <w:shd w:val="clear" w:fill="FBEEF7"/>
+              <w:pBdr>
+                <w:top w:val="single" w:sz="6" w:space="4" w:color="D9D9D9"/>
+                <w:left w:val="single" w:sz="6" w:space="4" w:color="D9D9D9"/>
+                <w:bottom w:val="single" w:sz="6" w:space="4" w:color="D9D9D9"/>
+                <w:right w:val="single" w:sz="6" w:space="4" w:color="D9D9D9"/>
+              </w:pBdr>
+            </w:pPr>
+            <w:r>
+              <w:rPr>
+                <w:b/>
+                <w:i w:val="0"/>
+                <w:color w:val="666666"/>
+                <w:sz w:val="18"/>
+              </w:rPr>
+              <w:t>TRECHO 7</w:t>
+            </w:r>
+            <w:r>
+              <w:br/>
+            </w:r>
+            <w:r>
+              <w:rPr>
+                <w:b w:val="0"/>
+                <w:i w:val="0"/>
+                <w:sz w:val="19"/>
+              </w:rPr>
+              <w:t>Reconhecer isso não é procurar defeito no relacionamento, é dar a si mesma o direito de sentir o que sente sem precisar justificar.</w:t>
             </w:r>
           </w:p>
           <w:p>
@@ -1055,7 +1735,7 @@
           </w:p>
           <w:p>
             <w:pPr>
-              <w:spacing w:after="100"/>
+              <w:spacing w:after="80"/>
             </w:pPr>
             <w:r>
               <w:rPr>
@@ -1063,7 +1743,31 @@
                 <w:i w:val="0"/>
                 <w:sz w:val="19"/>
               </w:rPr>
-              <w:t xml:space="preserve">SUBHEADLINE: </w:t>
+              <w:t>ROTEIRO (teleprompter):</w:t>
+            </w:r>
+          </w:p>
+          <w:p>
+            <w:pPr>
+              <w:spacing w:after="160" w:before="40"/>
+              <w:shd w:val="clear" w:fill="FBEEF7"/>
+              <w:pBdr>
+                <w:top w:val="single" w:sz="6" w:space="4" w:color="D9D9D9"/>
+                <w:left w:val="single" w:sz="6" w:space="4" w:color="D9D9D9"/>
+                <w:bottom w:val="single" w:sz="6" w:space="4" w:color="D9D9D9"/>
+                <w:right w:val="single" w:sz="6" w:space="4" w:color="D9D9D9"/>
+              </w:pBdr>
+            </w:pPr>
+            <w:r>
+              <w:rPr>
+                <w:b/>
+                <w:i w:val="0"/>
+                <w:color w:val="666666"/>
+                <w:sz w:val="18"/>
+              </w:rPr>
+              <w:t>TRECHO 1</w:t>
+            </w:r>
+            <w:r>
+              <w:br/>
             </w:r>
             <w:r>
               <w:rPr>
@@ -1071,7 +1775,199 @@
                 <w:i w:val="0"/>
                 <w:sz w:val="19"/>
               </w:rPr>
-              <w:t>Roteiro completo (teleprompter): "Tem gente que carrega até hoje a voz de um pai ou de uma mãe dizendo que nunca era o suficiente. Crescer perto de um pai ou mãe narcisista, ou simplesmente muito centrado nas próprias necessidades e pouco disponível emocionalmente, deixa marcas que não aparecem em fotografia de família. É a sensação de nunca ter feito por merecer o amor recebido, de precisar se esforçar demais pra ser vista, de sentir que os próprios sentimentos incomodam. E o mais difícil: como esse padrão vem de dentro de casa, muitas vezes ele nem é reconhecido como um problema, porque é assim que a família sempre foi. Só que esse padrão não fica só na infância. Ele se repete depois, em amizades, em relacionamentos amorosos, na forma como a pessoa se cobra, e até na dificuldade de acreditar que merece coisas boas. Entender essa raiz não é sobre culpar os pais, é sobre entender de onde vieram certas crenças, pra parar de repeti-las sem perceber. Esse é um dos temas que eu mais trago pro meu Grupo VIP, um espaço gratuito de WhatsApp, exclusivo para mulheres, onde converso toda semana sobre autoconhecimento, crenças limitantes e relacionamentos mais saudáveis."</w:t>
+              <w:t>Tem gente que carrega até hoje a voz de um pai ou de uma mãe dizendo que nunca era o suficiente.</w:t>
+            </w:r>
+          </w:p>
+          <w:p>
+            <w:pPr>
+              <w:spacing w:after="160" w:before="40"/>
+              <w:shd w:val="clear" w:fill="FBEEF7"/>
+              <w:pBdr>
+                <w:top w:val="single" w:sz="6" w:space="4" w:color="D9D9D9"/>
+                <w:left w:val="single" w:sz="6" w:space="4" w:color="D9D9D9"/>
+                <w:bottom w:val="single" w:sz="6" w:space="4" w:color="D9D9D9"/>
+                <w:right w:val="single" w:sz="6" w:space="4" w:color="D9D9D9"/>
+              </w:pBdr>
+            </w:pPr>
+            <w:r>
+              <w:rPr>
+                <w:b/>
+                <w:i w:val="0"/>
+                <w:color w:val="666666"/>
+                <w:sz w:val="18"/>
+              </w:rPr>
+              <w:t>TRECHO 2</w:t>
+            </w:r>
+            <w:r>
+              <w:br/>
+            </w:r>
+            <w:r>
+              <w:rPr>
+                <w:b w:val="0"/>
+                <w:i w:val="0"/>
+                <w:sz w:val="19"/>
+              </w:rPr>
+              <w:t>Crescer perto de um pai ou mãe narcisista, ou simplesmente muito centrado nas próprias necessidades e pouco disponível emocionalmente, deixa marcas que não aparecem em fotografia de família.</w:t>
+            </w:r>
+          </w:p>
+          <w:p>
+            <w:pPr>
+              <w:spacing w:after="160" w:before="40"/>
+              <w:shd w:val="clear" w:fill="FBEEF7"/>
+              <w:pBdr>
+                <w:top w:val="single" w:sz="6" w:space="4" w:color="D9D9D9"/>
+                <w:left w:val="single" w:sz="6" w:space="4" w:color="D9D9D9"/>
+                <w:bottom w:val="single" w:sz="6" w:space="4" w:color="D9D9D9"/>
+                <w:right w:val="single" w:sz="6" w:space="4" w:color="D9D9D9"/>
+              </w:pBdr>
+            </w:pPr>
+            <w:r>
+              <w:rPr>
+                <w:b/>
+                <w:i w:val="0"/>
+                <w:color w:val="666666"/>
+                <w:sz w:val="18"/>
+              </w:rPr>
+              <w:t>TRECHO 3</w:t>
+            </w:r>
+            <w:r>
+              <w:br/>
+            </w:r>
+            <w:r>
+              <w:rPr>
+                <w:b w:val="0"/>
+                <w:i w:val="0"/>
+                <w:sz w:val="19"/>
+              </w:rPr>
+              <w:t>É a sensação de nunca ter feito por merecer o amor recebido, de precisar se esforçar demais pra ser vista, de sentir que os próprios sentimentos incomodam.</w:t>
+            </w:r>
+          </w:p>
+          <w:p>
+            <w:pPr>
+              <w:spacing w:after="160" w:before="40"/>
+              <w:shd w:val="clear" w:fill="FBEEF7"/>
+              <w:pBdr>
+                <w:top w:val="single" w:sz="6" w:space="4" w:color="D9D9D9"/>
+                <w:left w:val="single" w:sz="6" w:space="4" w:color="D9D9D9"/>
+                <w:bottom w:val="single" w:sz="6" w:space="4" w:color="D9D9D9"/>
+                <w:right w:val="single" w:sz="6" w:space="4" w:color="D9D9D9"/>
+              </w:pBdr>
+            </w:pPr>
+            <w:r>
+              <w:rPr>
+                <w:b/>
+                <w:i w:val="0"/>
+                <w:color w:val="666666"/>
+                <w:sz w:val="18"/>
+              </w:rPr>
+              <w:t>TRECHO 4</w:t>
+            </w:r>
+            <w:r>
+              <w:br/>
+            </w:r>
+            <w:r>
+              <w:rPr>
+                <w:b w:val="0"/>
+                <w:i w:val="0"/>
+                <w:sz w:val="19"/>
+              </w:rPr>
+              <w:t>E o mais difícil: como esse padrão vem de dentro de casa, muitas vezes ele nem é reconhecido como um problema, porque é assim que a família sempre foi.</w:t>
+            </w:r>
+          </w:p>
+          <w:p>
+            <w:pPr>
+              <w:spacing w:after="160" w:before="40"/>
+              <w:shd w:val="clear" w:fill="FBEEF7"/>
+              <w:pBdr>
+                <w:top w:val="single" w:sz="6" w:space="4" w:color="D9D9D9"/>
+                <w:left w:val="single" w:sz="6" w:space="4" w:color="D9D9D9"/>
+                <w:bottom w:val="single" w:sz="6" w:space="4" w:color="D9D9D9"/>
+                <w:right w:val="single" w:sz="6" w:space="4" w:color="D9D9D9"/>
+              </w:pBdr>
+            </w:pPr>
+            <w:r>
+              <w:rPr>
+                <w:b/>
+                <w:i w:val="0"/>
+                <w:color w:val="666666"/>
+                <w:sz w:val="18"/>
+              </w:rPr>
+              <w:t>TRECHO 5</w:t>
+            </w:r>
+            <w:r>
+              <w:br/>
+            </w:r>
+            <w:r>
+              <w:rPr>
+                <w:b w:val="0"/>
+                <w:i w:val="0"/>
+                <w:sz w:val="19"/>
+              </w:rPr>
+              <w:t>Só que esse padrão não fica só na infância. Ele se repete depois, em amizades, em relacionamentos amorosos, na forma como a pessoa se cobra, e até na dificuldade de acreditar que merece coisas boas.</w:t>
+            </w:r>
+          </w:p>
+          <w:p>
+            <w:pPr>
+              <w:spacing w:after="160" w:before="40"/>
+              <w:shd w:val="clear" w:fill="FBEEF7"/>
+              <w:pBdr>
+                <w:top w:val="single" w:sz="6" w:space="4" w:color="D9D9D9"/>
+                <w:left w:val="single" w:sz="6" w:space="4" w:color="D9D9D9"/>
+                <w:bottom w:val="single" w:sz="6" w:space="4" w:color="D9D9D9"/>
+                <w:right w:val="single" w:sz="6" w:space="4" w:color="D9D9D9"/>
+              </w:pBdr>
+            </w:pPr>
+            <w:r>
+              <w:rPr>
+                <w:b/>
+                <w:i w:val="0"/>
+                <w:color w:val="666666"/>
+                <w:sz w:val="18"/>
+              </w:rPr>
+              <w:t>TRECHO 6</w:t>
+            </w:r>
+            <w:r>
+              <w:br/>
+            </w:r>
+            <w:r>
+              <w:rPr>
+                <w:b w:val="0"/>
+                <w:i w:val="0"/>
+                <w:sz w:val="19"/>
+              </w:rPr>
+              <w:t>Entender essa raiz não é sobre culpar os pais, é sobre entender de onde vieram certas crenças, pra parar de repeti-las sem perceber.</w:t>
+            </w:r>
+          </w:p>
+          <w:p>
+            <w:pPr>
+              <w:spacing w:after="160" w:before="40"/>
+              <w:shd w:val="clear" w:fill="FBEEF7"/>
+              <w:pBdr>
+                <w:top w:val="single" w:sz="6" w:space="4" w:color="D9D9D9"/>
+                <w:left w:val="single" w:sz="6" w:space="4" w:color="D9D9D9"/>
+                <w:bottom w:val="single" w:sz="6" w:space="4" w:color="D9D9D9"/>
+                <w:right w:val="single" w:sz="6" w:space="4" w:color="D9D9D9"/>
+              </w:pBdr>
+            </w:pPr>
+            <w:r>
+              <w:rPr>
+                <w:b/>
+                <w:i w:val="0"/>
+                <w:color w:val="666666"/>
+                <w:sz w:val="18"/>
+              </w:rPr>
+              <w:t>TRECHO 7</w:t>
+            </w:r>
+            <w:r>
+              <w:br/>
+            </w:r>
+            <w:r>
+              <w:rPr>
+                <w:b w:val="0"/>
+                <w:i w:val="0"/>
+                <w:sz w:val="19"/>
+              </w:rPr>
+              <w:t>Esse é um dos temas que eu mais trago pro meu Grupo VIP, um espaço gratuito de WhatsApp, exclusivo para mulheres, onde converso toda semana sobre autoconhecimento, crenças limitantes e relacionamentos mais saudáveis.</w:t>
             </w:r>
           </w:p>
           <w:p>
@@ -1587,7 +2483,7 @@
           </w:p>
           <w:p>
             <w:pPr>
-              <w:spacing w:after="100"/>
+              <w:spacing w:after="80"/>
             </w:pPr>
             <w:r>
               <w:rPr>
@@ -1595,7 +2491,31 @@
                 <w:i w:val="0"/>
                 <w:sz w:val="19"/>
               </w:rPr>
-              <w:t xml:space="preserve">SUBHEADLINE: </w:t>
+              <w:t>ROTEIRO (teleprompter):</w:t>
+            </w:r>
+          </w:p>
+          <w:p>
+            <w:pPr>
+              <w:spacing w:after="160" w:before="40"/>
+              <w:shd w:val="clear" w:fill="FBEEF7"/>
+              <w:pBdr>
+                <w:top w:val="single" w:sz="6" w:space="4" w:color="D9D9D9"/>
+                <w:left w:val="single" w:sz="6" w:space="4" w:color="D9D9D9"/>
+                <w:bottom w:val="single" w:sz="6" w:space="4" w:color="D9D9D9"/>
+                <w:right w:val="single" w:sz="6" w:space="4" w:color="D9D9D9"/>
+              </w:pBdr>
+            </w:pPr>
+            <w:r>
+              <w:rPr>
+                <w:b/>
+                <w:i w:val="0"/>
+                <w:color w:val="666666"/>
+                <w:sz w:val="18"/>
+              </w:rPr>
+              <w:t>TRECHO 1</w:t>
+            </w:r>
+            <w:r>
+              <w:br/>
             </w:r>
             <w:r>
               <w:rPr>
@@ -1603,7 +2523,231 @@
                 <w:i w:val="0"/>
                 <w:sz w:val="19"/>
               </w:rPr>
-              <w:t>Roteiro completo (teleprompter): "Deixa eu te contar o caso da Joana. No começo do relacionamento, ela achava que tinha muita sorte: o namorado sempre sabia exatamente o que dizer, elogiava tudo nela, dizia que ela era diferente de todo mundo. Só que, com o tempo, ela percebeu um padrão: toda conversa, de algum jeito, voltava pra ele. Os problemas dela nunca eram tão importantes quanto os dele. E quando ela discordava de alguma coisa, ele fazia ela se sentir culpada por isso. Ela não sabia nomear o que estava sentindo, só sabia que, cada vez mais, se sentia pequena, e que se policiava antes de expressar qualquer necessidade. Isso é um padrão comum em relacionamentos com traços narcisistas: idealização intensa no começo, seguida de uma dinâmica onde as necessidades da outra pessoa deixam de importar, e qualquer tentativa de se posicionar é tratada como drama ou exagero. Ela levou um tempo pra reconhecer isso, porque, de fora, o relacionamento até parecia bom. Ele não era agressivo na forma como a gente costuma imaginar. A gente trabalhou juntas pra ela reconstruir a confiança na própria percepção, entender que sentir que algo está errado, mesmo sem provas óbvias, também é uma informação válida. Hoje ela consegue reconhecer esses sinais muito mais cedo, e principalmente, confiar em si mesma de novo. Por questões de sigilo profissional, eu dei um nome fictício aqui para um exemplo muito comum que vejo nas sessões de terapia todos os meses."</w:t>
+              <w:t>Deixa eu te contar o caso da Joana. No começo do relacionamento, ela achava que tinha muita sorte: o namorado sempre sabia exatamente o que dizer, elogiava tudo nela, dizia que ela era diferente de todo mundo.</w:t>
+            </w:r>
+          </w:p>
+          <w:p>
+            <w:pPr>
+              <w:spacing w:after="160" w:before="40"/>
+              <w:shd w:val="clear" w:fill="FBEEF7"/>
+              <w:pBdr>
+                <w:top w:val="single" w:sz="6" w:space="4" w:color="D9D9D9"/>
+                <w:left w:val="single" w:sz="6" w:space="4" w:color="D9D9D9"/>
+                <w:bottom w:val="single" w:sz="6" w:space="4" w:color="D9D9D9"/>
+                <w:right w:val="single" w:sz="6" w:space="4" w:color="D9D9D9"/>
+              </w:pBdr>
+            </w:pPr>
+            <w:r>
+              <w:rPr>
+                <w:b/>
+                <w:i w:val="0"/>
+                <w:color w:val="666666"/>
+                <w:sz w:val="18"/>
+              </w:rPr>
+              <w:t>TRECHO 2</w:t>
+            </w:r>
+            <w:r>
+              <w:br/>
+            </w:r>
+            <w:r>
+              <w:rPr>
+                <w:b w:val="0"/>
+                <w:i w:val="0"/>
+                <w:sz w:val="19"/>
+              </w:rPr>
+              <w:t>Só que, com o tempo, ela percebeu um padrão: toda conversa, de algum jeito, voltava pra ele. Os problemas dela nunca eram tão importantes quanto os dele. E quando ela discordava de alguma coisa, ele fazia ela se sentir culpada por isso.</w:t>
+            </w:r>
+          </w:p>
+          <w:p>
+            <w:pPr>
+              <w:spacing w:after="160" w:before="40"/>
+              <w:shd w:val="clear" w:fill="FBEEF7"/>
+              <w:pBdr>
+                <w:top w:val="single" w:sz="6" w:space="4" w:color="D9D9D9"/>
+                <w:left w:val="single" w:sz="6" w:space="4" w:color="D9D9D9"/>
+                <w:bottom w:val="single" w:sz="6" w:space="4" w:color="D9D9D9"/>
+                <w:right w:val="single" w:sz="6" w:space="4" w:color="D9D9D9"/>
+              </w:pBdr>
+            </w:pPr>
+            <w:r>
+              <w:rPr>
+                <w:b/>
+                <w:i w:val="0"/>
+                <w:color w:val="666666"/>
+                <w:sz w:val="18"/>
+              </w:rPr>
+              <w:t>TRECHO 3</w:t>
+            </w:r>
+            <w:r>
+              <w:br/>
+            </w:r>
+            <w:r>
+              <w:rPr>
+                <w:b w:val="0"/>
+                <w:i w:val="0"/>
+                <w:sz w:val="19"/>
+              </w:rPr>
+              <w:t>Ela não sabia nomear o que estava sentindo, só sabia que, cada vez mais, se sentia pequena, e que se policiava antes de expressar qualquer necessidade.</w:t>
+            </w:r>
+          </w:p>
+          <w:p>
+            <w:pPr>
+              <w:spacing w:after="160" w:before="40"/>
+              <w:shd w:val="clear" w:fill="FBEEF7"/>
+              <w:pBdr>
+                <w:top w:val="single" w:sz="6" w:space="4" w:color="D9D9D9"/>
+                <w:left w:val="single" w:sz="6" w:space="4" w:color="D9D9D9"/>
+                <w:bottom w:val="single" w:sz="6" w:space="4" w:color="D9D9D9"/>
+                <w:right w:val="single" w:sz="6" w:space="4" w:color="D9D9D9"/>
+              </w:pBdr>
+            </w:pPr>
+            <w:r>
+              <w:rPr>
+                <w:b/>
+                <w:i w:val="0"/>
+                <w:color w:val="666666"/>
+                <w:sz w:val="18"/>
+              </w:rPr>
+              <w:t>TRECHO 4</w:t>
+            </w:r>
+            <w:r>
+              <w:br/>
+            </w:r>
+            <w:r>
+              <w:rPr>
+                <w:b w:val="0"/>
+                <w:i w:val="0"/>
+                <w:sz w:val="19"/>
+              </w:rPr>
+              <w:t>Isso é um padrão comum em relacionamentos com traços narcisistas: idealização intensa no começo, seguida de uma dinâmica onde as necessidades da outra pessoa deixam de importar, e qualquer tentativa de se posicionar é tratada como drama ou exagero.</w:t>
+            </w:r>
+          </w:p>
+          <w:p>
+            <w:pPr>
+              <w:spacing w:after="160" w:before="40"/>
+              <w:shd w:val="clear" w:fill="FBEEF7"/>
+              <w:pBdr>
+                <w:top w:val="single" w:sz="6" w:space="4" w:color="D9D9D9"/>
+                <w:left w:val="single" w:sz="6" w:space="4" w:color="D9D9D9"/>
+                <w:bottom w:val="single" w:sz="6" w:space="4" w:color="D9D9D9"/>
+                <w:right w:val="single" w:sz="6" w:space="4" w:color="D9D9D9"/>
+              </w:pBdr>
+            </w:pPr>
+            <w:r>
+              <w:rPr>
+                <w:b/>
+                <w:i w:val="0"/>
+                <w:color w:val="666666"/>
+                <w:sz w:val="18"/>
+              </w:rPr>
+              <w:t>TRECHO 5</w:t>
+            </w:r>
+            <w:r>
+              <w:br/>
+            </w:r>
+            <w:r>
+              <w:rPr>
+                <w:b w:val="0"/>
+                <w:i w:val="0"/>
+                <w:sz w:val="19"/>
+              </w:rPr>
+              <w:t>Ela levou um tempo pra reconhecer isso, porque, de fora, o relacionamento até parecia bom. Ele não era agressivo na forma como a gente costuma imaginar.</w:t>
+            </w:r>
+          </w:p>
+          <w:p>
+            <w:pPr>
+              <w:spacing w:after="160" w:before="40"/>
+              <w:shd w:val="clear" w:fill="FBEEF7"/>
+              <w:pBdr>
+                <w:top w:val="single" w:sz="6" w:space="4" w:color="D9D9D9"/>
+                <w:left w:val="single" w:sz="6" w:space="4" w:color="D9D9D9"/>
+                <w:bottom w:val="single" w:sz="6" w:space="4" w:color="D9D9D9"/>
+                <w:right w:val="single" w:sz="6" w:space="4" w:color="D9D9D9"/>
+              </w:pBdr>
+            </w:pPr>
+            <w:r>
+              <w:rPr>
+                <w:b/>
+                <w:i w:val="0"/>
+                <w:color w:val="666666"/>
+                <w:sz w:val="18"/>
+              </w:rPr>
+              <w:t>TRECHO 6</w:t>
+            </w:r>
+            <w:r>
+              <w:br/>
+            </w:r>
+            <w:r>
+              <w:rPr>
+                <w:b w:val="0"/>
+                <w:i w:val="0"/>
+                <w:sz w:val="19"/>
+              </w:rPr>
+              <w:t>A gente trabalhou juntas pra ela reconstruir a confiança na própria percepção, entender que sentir que algo está errado, mesmo sem provas óbvias, também é uma informação válida.</w:t>
+            </w:r>
+          </w:p>
+          <w:p>
+            <w:pPr>
+              <w:spacing w:after="160" w:before="40"/>
+              <w:shd w:val="clear" w:fill="FBEEF7"/>
+              <w:pBdr>
+                <w:top w:val="single" w:sz="6" w:space="4" w:color="D9D9D9"/>
+                <w:left w:val="single" w:sz="6" w:space="4" w:color="D9D9D9"/>
+                <w:bottom w:val="single" w:sz="6" w:space="4" w:color="D9D9D9"/>
+                <w:right w:val="single" w:sz="6" w:space="4" w:color="D9D9D9"/>
+              </w:pBdr>
+            </w:pPr>
+            <w:r>
+              <w:rPr>
+                <w:b/>
+                <w:i w:val="0"/>
+                <w:color w:val="666666"/>
+                <w:sz w:val="18"/>
+              </w:rPr>
+              <w:t>TRECHO 7</w:t>
+            </w:r>
+            <w:r>
+              <w:br/>
+            </w:r>
+            <w:r>
+              <w:rPr>
+                <w:b w:val="0"/>
+                <w:i w:val="0"/>
+                <w:sz w:val="19"/>
+              </w:rPr>
+              <w:t>Hoje ela consegue reconhecer esses sinais muito mais cedo, e principalmente, confiar em si mesma de novo.</w:t>
+            </w:r>
+          </w:p>
+          <w:p>
+            <w:pPr>
+              <w:spacing w:after="160" w:before="40"/>
+              <w:shd w:val="clear" w:fill="FBEEF7"/>
+              <w:pBdr>
+                <w:top w:val="single" w:sz="6" w:space="4" w:color="D9D9D9"/>
+                <w:left w:val="single" w:sz="6" w:space="4" w:color="D9D9D9"/>
+                <w:bottom w:val="single" w:sz="6" w:space="4" w:color="D9D9D9"/>
+                <w:right w:val="single" w:sz="6" w:space="4" w:color="D9D9D9"/>
+              </w:pBdr>
+            </w:pPr>
+            <w:r>
+              <w:rPr>
+                <w:b/>
+                <w:i w:val="0"/>
+                <w:color w:val="666666"/>
+                <w:sz w:val="18"/>
+              </w:rPr>
+              <w:t>TRECHO 8</w:t>
+            </w:r>
+            <w:r>
+              <w:br/>
+            </w:r>
+            <w:r>
+              <w:rPr>
+                <w:b w:val="0"/>
+                <w:i w:val="0"/>
+                <w:sz w:val="19"/>
+              </w:rPr>
+              <w:t>Por questões de sigilo profissional, eu dei um nome fictício aqui para um exemplo muito comum que vejo nas sessões de terapia todos os meses.</w:t>
             </w:r>
           </w:p>
           <w:p>
@@ -2119,7 +3263,7 @@
           </w:p>
           <w:p>
             <w:pPr>
-              <w:spacing w:after="100"/>
+              <w:spacing w:after="80"/>
             </w:pPr>
             <w:r>
               <w:rPr>
@@ -2127,7 +3271,31 @@
                 <w:i w:val="0"/>
                 <w:sz w:val="19"/>
               </w:rPr>
-              <w:t xml:space="preserve">SUBHEADLINE: </w:t>
+              <w:t>ROTEIRO (teleprompter):</w:t>
+            </w:r>
+          </w:p>
+          <w:p>
+            <w:pPr>
+              <w:spacing w:after="160" w:before="40"/>
+              <w:shd w:val="clear" w:fill="FBEEF7"/>
+              <w:pBdr>
+                <w:top w:val="single" w:sz="6" w:space="4" w:color="D9D9D9"/>
+                <w:left w:val="single" w:sz="6" w:space="4" w:color="D9D9D9"/>
+                <w:bottom w:val="single" w:sz="6" w:space="4" w:color="D9D9D9"/>
+                <w:right w:val="single" w:sz="6" w:space="4" w:color="D9D9D9"/>
+              </w:pBdr>
+            </w:pPr>
+            <w:r>
+              <w:rPr>
+                <w:b/>
+                <w:i w:val="0"/>
+                <w:color w:val="666666"/>
+                <w:sz w:val="18"/>
+              </w:rPr>
+              <w:t>TRECHO 1</w:t>
+            </w:r>
+            <w:r>
+              <w:br/>
             </w:r>
             <w:r>
               <w:rPr>
@@ -2135,7 +3303,231 @@
                 <w:i w:val="0"/>
                 <w:sz w:val="19"/>
               </w:rPr>
-              <w:t>Roteiro completo (teleprompter): "Deixa eu te contar o caso da Aline. Ela sabia, há tempos, que aquele relacionamento não fazia bem. As brigas eram constantes, ela vivia ansiosa, e as pessoas mais próximas já tinham comentado a mudança nela. Mesmo assim, ela não conseguia sair. Não era falta de clareza. Ela sabia exatamente o que estava errado. O que faltava era coragem, e um medo enorme do que viria depois: ficar sozinha, ter que recomeçar, ou não saber quem ela era fora daquela relação. Isso é mais comum do que parece. Às vezes a gente permanece num lugar que não faz bem, não porque não vê o problema, mas porque o medo do vazio depois é maior que o desconforto de ficar. Na terapia, a gente trabalhou primeiro esse medo, entender de onde ele vinha, muitas vezes de uma história antiga de abandono ou de instabilidade, antes mesmo de falar sobre o relacionamento em si. Porque não adianta só ter coragem quando o medo de base nunca foi trabalhado. A pessoa sai de um relacionamento assim e, sem entender a raiz, corre o risco de repetir o padrão no próximo. Ela levou alguns meses, mas conseguiu não só sair do relacionamento, como principalmente entender por que ficava tanto tempo em lugares que não faziam bem pra ela. E isso resume um pouco tudo que a gente conversou esse mês por aqui: relacionamento com o outro, relacionamento com a família, relacionamento com você mesma. No fundo, é sempre sobre os mesmos padrões se repetindo em contextos diferentes. Por questões de sigilo profissional, o nome da Aline é fictício. Não é um caso específico de ninguém, é um relato que eu escuto bastante nas sessões de terapia."</w:t>
+              <w:t>Deixa eu te contar o caso da Aline. Ela sabia, há tempos, que aquele relacionamento não fazia bem. As brigas eram constantes, ela vivia ansiosa, e as pessoas mais próximas já tinham comentado a mudança nela. Mesmo assim, ela não conseguia sair.</w:t>
+            </w:r>
+          </w:p>
+          <w:p>
+            <w:pPr>
+              <w:spacing w:after="160" w:before="40"/>
+              <w:shd w:val="clear" w:fill="FBEEF7"/>
+              <w:pBdr>
+                <w:top w:val="single" w:sz="6" w:space="4" w:color="D9D9D9"/>
+                <w:left w:val="single" w:sz="6" w:space="4" w:color="D9D9D9"/>
+                <w:bottom w:val="single" w:sz="6" w:space="4" w:color="D9D9D9"/>
+                <w:right w:val="single" w:sz="6" w:space="4" w:color="D9D9D9"/>
+              </w:pBdr>
+            </w:pPr>
+            <w:r>
+              <w:rPr>
+                <w:b/>
+                <w:i w:val="0"/>
+                <w:color w:val="666666"/>
+                <w:sz w:val="18"/>
+              </w:rPr>
+              <w:t>TRECHO 2</w:t>
+            </w:r>
+            <w:r>
+              <w:br/>
+            </w:r>
+            <w:r>
+              <w:rPr>
+                <w:b w:val="0"/>
+                <w:i w:val="0"/>
+                <w:sz w:val="19"/>
+              </w:rPr>
+              <w:t>Não era falta de clareza. Ela sabia exatamente o que estava errado. O que faltava era coragem, e um medo enorme do que viria depois: ficar sozinha, ter que recomeçar, ou não saber quem ela era fora daquela relação.</w:t>
+            </w:r>
+          </w:p>
+          <w:p>
+            <w:pPr>
+              <w:spacing w:after="160" w:before="40"/>
+              <w:shd w:val="clear" w:fill="FBEEF7"/>
+              <w:pBdr>
+                <w:top w:val="single" w:sz="6" w:space="4" w:color="D9D9D9"/>
+                <w:left w:val="single" w:sz="6" w:space="4" w:color="D9D9D9"/>
+                <w:bottom w:val="single" w:sz="6" w:space="4" w:color="D9D9D9"/>
+                <w:right w:val="single" w:sz="6" w:space="4" w:color="D9D9D9"/>
+              </w:pBdr>
+            </w:pPr>
+            <w:r>
+              <w:rPr>
+                <w:b/>
+                <w:i w:val="0"/>
+                <w:color w:val="666666"/>
+                <w:sz w:val="18"/>
+              </w:rPr>
+              <w:t>TRECHO 3</w:t>
+            </w:r>
+            <w:r>
+              <w:br/>
+            </w:r>
+            <w:r>
+              <w:rPr>
+                <w:b w:val="0"/>
+                <w:i w:val="0"/>
+                <w:sz w:val="19"/>
+              </w:rPr>
+              <w:t>Isso é mais comum do que parece. Às vezes a gente permanece num lugar que não faz bem, não porque não vê o problema, mas porque o medo do vazio depois é maior que o desconforto de ficar.</w:t>
+            </w:r>
+          </w:p>
+          <w:p>
+            <w:pPr>
+              <w:spacing w:after="160" w:before="40"/>
+              <w:shd w:val="clear" w:fill="FBEEF7"/>
+              <w:pBdr>
+                <w:top w:val="single" w:sz="6" w:space="4" w:color="D9D9D9"/>
+                <w:left w:val="single" w:sz="6" w:space="4" w:color="D9D9D9"/>
+                <w:bottom w:val="single" w:sz="6" w:space="4" w:color="D9D9D9"/>
+                <w:right w:val="single" w:sz="6" w:space="4" w:color="D9D9D9"/>
+              </w:pBdr>
+            </w:pPr>
+            <w:r>
+              <w:rPr>
+                <w:b/>
+                <w:i w:val="0"/>
+                <w:color w:val="666666"/>
+                <w:sz w:val="18"/>
+              </w:rPr>
+              <w:t>TRECHO 4</w:t>
+            </w:r>
+            <w:r>
+              <w:br/>
+            </w:r>
+            <w:r>
+              <w:rPr>
+                <w:b w:val="0"/>
+                <w:i w:val="0"/>
+                <w:sz w:val="19"/>
+              </w:rPr>
+              <w:t>Na terapia, a gente trabalhou primeiro esse medo, entender de onde ele vinha, muitas vezes de uma história antiga de abandono ou de instabilidade, antes mesmo de falar sobre o relacionamento em si.</w:t>
+            </w:r>
+          </w:p>
+          <w:p>
+            <w:pPr>
+              <w:spacing w:after="160" w:before="40"/>
+              <w:shd w:val="clear" w:fill="FBEEF7"/>
+              <w:pBdr>
+                <w:top w:val="single" w:sz="6" w:space="4" w:color="D9D9D9"/>
+                <w:left w:val="single" w:sz="6" w:space="4" w:color="D9D9D9"/>
+                <w:bottom w:val="single" w:sz="6" w:space="4" w:color="D9D9D9"/>
+                <w:right w:val="single" w:sz="6" w:space="4" w:color="D9D9D9"/>
+              </w:pBdr>
+            </w:pPr>
+            <w:r>
+              <w:rPr>
+                <w:b/>
+                <w:i w:val="0"/>
+                <w:color w:val="666666"/>
+                <w:sz w:val="18"/>
+              </w:rPr>
+              <w:t>TRECHO 5</w:t>
+            </w:r>
+            <w:r>
+              <w:br/>
+            </w:r>
+            <w:r>
+              <w:rPr>
+                <w:b w:val="0"/>
+                <w:i w:val="0"/>
+                <w:sz w:val="19"/>
+              </w:rPr>
+              <w:t>Porque não adianta só ter coragem quando o medo de base nunca foi trabalhado. A pessoa sai de um relacionamento assim e, sem entender a raiz, corre o risco de repetir o padrão no próximo.</w:t>
+            </w:r>
+          </w:p>
+          <w:p>
+            <w:pPr>
+              <w:spacing w:after="160" w:before="40"/>
+              <w:shd w:val="clear" w:fill="FBEEF7"/>
+              <w:pBdr>
+                <w:top w:val="single" w:sz="6" w:space="4" w:color="D9D9D9"/>
+                <w:left w:val="single" w:sz="6" w:space="4" w:color="D9D9D9"/>
+                <w:bottom w:val="single" w:sz="6" w:space="4" w:color="D9D9D9"/>
+                <w:right w:val="single" w:sz="6" w:space="4" w:color="D9D9D9"/>
+              </w:pBdr>
+            </w:pPr>
+            <w:r>
+              <w:rPr>
+                <w:b/>
+                <w:i w:val="0"/>
+                <w:color w:val="666666"/>
+                <w:sz w:val="18"/>
+              </w:rPr>
+              <w:t>TRECHO 6</w:t>
+            </w:r>
+            <w:r>
+              <w:br/>
+            </w:r>
+            <w:r>
+              <w:rPr>
+                <w:b w:val="0"/>
+                <w:i w:val="0"/>
+                <w:sz w:val="19"/>
+              </w:rPr>
+              <w:t>Ela levou alguns meses, mas conseguiu não só sair do relacionamento, como principalmente entender por que ficava tanto tempo em lugares que não faziam bem pra ela.</w:t>
+            </w:r>
+          </w:p>
+          <w:p>
+            <w:pPr>
+              <w:spacing w:after="160" w:before="40"/>
+              <w:shd w:val="clear" w:fill="FBEEF7"/>
+              <w:pBdr>
+                <w:top w:val="single" w:sz="6" w:space="4" w:color="D9D9D9"/>
+                <w:left w:val="single" w:sz="6" w:space="4" w:color="D9D9D9"/>
+                <w:bottom w:val="single" w:sz="6" w:space="4" w:color="D9D9D9"/>
+                <w:right w:val="single" w:sz="6" w:space="4" w:color="D9D9D9"/>
+              </w:pBdr>
+            </w:pPr>
+            <w:r>
+              <w:rPr>
+                <w:b/>
+                <w:i w:val="0"/>
+                <w:color w:val="666666"/>
+                <w:sz w:val="18"/>
+              </w:rPr>
+              <w:t>TRECHO 7</w:t>
+            </w:r>
+            <w:r>
+              <w:br/>
+            </w:r>
+            <w:r>
+              <w:rPr>
+                <w:b w:val="0"/>
+                <w:i w:val="0"/>
+                <w:sz w:val="19"/>
+              </w:rPr>
+              <w:t>E isso resume um pouco tudo que a gente conversou esse mês por aqui: relacionamento com o outro, relacionamento com a família, relacionamento com você mesma. No fundo, é sempre sobre os mesmos padrões se repetindo em contextos diferentes.</w:t>
+            </w:r>
+          </w:p>
+          <w:p>
+            <w:pPr>
+              <w:spacing w:after="160" w:before="40"/>
+              <w:shd w:val="clear" w:fill="FBEEF7"/>
+              <w:pBdr>
+                <w:top w:val="single" w:sz="6" w:space="4" w:color="D9D9D9"/>
+                <w:left w:val="single" w:sz="6" w:space="4" w:color="D9D9D9"/>
+                <w:bottom w:val="single" w:sz="6" w:space="4" w:color="D9D9D9"/>
+                <w:right w:val="single" w:sz="6" w:space="4" w:color="D9D9D9"/>
+              </w:pBdr>
+            </w:pPr>
+            <w:r>
+              <w:rPr>
+                <w:b/>
+                <w:i w:val="0"/>
+                <w:color w:val="666666"/>
+                <w:sz w:val="18"/>
+              </w:rPr>
+              <w:t>TRECHO 8</w:t>
+            </w:r>
+            <w:r>
+              <w:br/>
+            </w:r>
+            <w:r>
+              <w:rPr>
+                <w:b w:val="0"/>
+                <w:i w:val="0"/>
+                <w:sz w:val="19"/>
+              </w:rPr>
+              <w:t>Por questões de sigilo profissional, o nome da Aline é fictício. Não é um caso específico de ninguém, é um relato que eu escuto bastante nas sessões de terapia.</w:t>
             </w:r>
           </w:p>
           <w:p>
@@ -2425,7 +3817,7 @@
           </w:p>
           <w:p>
             <w:pPr>
-              <w:spacing w:after="100"/>
+              <w:spacing w:after="80"/>
             </w:pPr>
             <w:r>
               <w:rPr>
@@ -2433,7 +3825,31 @@
                 <w:i w:val="0"/>
                 <w:sz w:val="19"/>
               </w:rPr>
-              <w:t xml:space="preserve">SUBHEADLINE: </w:t>
+              <w:t>ROTEIRO (teleprompter):</w:t>
+            </w:r>
+          </w:p>
+          <w:p>
+            <w:pPr>
+              <w:spacing w:after="160" w:before="40"/>
+              <w:shd w:val="clear" w:fill="FBEEF7"/>
+              <w:pBdr>
+                <w:top w:val="single" w:sz="6" w:space="4" w:color="D9D9D9"/>
+                <w:left w:val="single" w:sz="6" w:space="4" w:color="D9D9D9"/>
+                <w:bottom w:val="single" w:sz="6" w:space="4" w:color="D9D9D9"/>
+                <w:right w:val="single" w:sz="6" w:space="4" w:color="D9D9D9"/>
+              </w:pBdr>
+            </w:pPr>
+            <w:r>
+              <w:rPr>
+                <w:b/>
+                <w:i w:val="0"/>
+                <w:color w:val="666666"/>
+                <w:sz w:val="18"/>
+              </w:rPr>
+              <w:t>TRECHO 1</w:t>
+            </w:r>
+            <w:r>
+              <w:br/>
             </w:r>
             <w:r>
               <w:rPr>
@@ -2441,7 +3857,199 @@
                 <w:i w:val="0"/>
                 <w:sz w:val="19"/>
               </w:rPr>
-              <w:t>Roteiro completo (teleprompter): "A conversa era ótima, teve encontro, tava tudo indo bem, parecia que finalmente tinha dado certo. E do nada, a pessoa some. Sem explicação, sem aviso, do nada. Isso tem nome, ghosting, mas o que pouca gente sabe é que, muitas vezes, por trás disso tem um padrão bem mais profundo: o apego evitativo. Gente com esse padrão costuma se aproximar rápido, às vezes até intenso demais no começo, uma atenção enorme, mensagens o dia todo, aquela sensação de conexão instantânea. Só que, assim que a relação começa a ficar séria de verdade, alguma coisa dispara internamente um alarme de perigo. E, ao invés de falar sobre isso, a pessoa evita, se afasta, ou simplesmente some. Não é sobre falta de interesse, na maioria das vezes. É medo de intimidade, de depender de alguém, de ser vista de verdade e, quem sabe, magoada depois. E para quem está do outro lado, isso dói duas vezes: primeiro pelo sumiço em si, segundo por não entender o que aconteceu, o que geralmente leva a procurar defeito em si mesma, quando na verdade era um padrão do outro se manifestando. Entender esse padrão, seja no outro ou em você mesma, muda completamente a forma de lidar com relações assim, ou até de reconhecer os primeiros sinais antes de se machucar de novo."</w:t>
+              <w:t>A conversa era ótima, teve encontro, tava tudo indo bem, parecia que finalmente tinha dado certo. E do nada, a pessoa some. Sem explicação, sem aviso, do nada.</w:t>
+            </w:r>
+          </w:p>
+          <w:p>
+            <w:pPr>
+              <w:spacing w:after="160" w:before="40"/>
+              <w:shd w:val="clear" w:fill="FBEEF7"/>
+              <w:pBdr>
+                <w:top w:val="single" w:sz="6" w:space="4" w:color="D9D9D9"/>
+                <w:left w:val="single" w:sz="6" w:space="4" w:color="D9D9D9"/>
+                <w:bottom w:val="single" w:sz="6" w:space="4" w:color="D9D9D9"/>
+                <w:right w:val="single" w:sz="6" w:space="4" w:color="D9D9D9"/>
+              </w:pBdr>
+            </w:pPr>
+            <w:r>
+              <w:rPr>
+                <w:b/>
+                <w:i w:val="0"/>
+                <w:color w:val="666666"/>
+                <w:sz w:val="18"/>
+              </w:rPr>
+              <w:t>TRECHO 2</w:t>
+            </w:r>
+            <w:r>
+              <w:br/>
+            </w:r>
+            <w:r>
+              <w:rPr>
+                <w:b w:val="0"/>
+                <w:i w:val="0"/>
+                <w:sz w:val="19"/>
+              </w:rPr>
+              <w:t>Isso tem nome, ghosting, mas o que pouca gente sabe é que, muitas vezes, por trás disso tem um padrão bem mais profundo: o apego evitativo.</w:t>
+            </w:r>
+          </w:p>
+          <w:p>
+            <w:pPr>
+              <w:spacing w:after="160" w:before="40"/>
+              <w:shd w:val="clear" w:fill="FBEEF7"/>
+              <w:pBdr>
+                <w:top w:val="single" w:sz="6" w:space="4" w:color="D9D9D9"/>
+                <w:left w:val="single" w:sz="6" w:space="4" w:color="D9D9D9"/>
+                <w:bottom w:val="single" w:sz="6" w:space="4" w:color="D9D9D9"/>
+                <w:right w:val="single" w:sz="6" w:space="4" w:color="D9D9D9"/>
+              </w:pBdr>
+            </w:pPr>
+            <w:r>
+              <w:rPr>
+                <w:b/>
+                <w:i w:val="0"/>
+                <w:color w:val="666666"/>
+                <w:sz w:val="18"/>
+              </w:rPr>
+              <w:t>TRECHO 3</w:t>
+            </w:r>
+            <w:r>
+              <w:br/>
+            </w:r>
+            <w:r>
+              <w:rPr>
+                <w:b w:val="0"/>
+                <w:i w:val="0"/>
+                <w:sz w:val="19"/>
+              </w:rPr>
+              <w:t>Gente com esse padrão costuma se aproximar rápido, às vezes até intenso demais no começo, uma atenção enorme, mensagens o dia todo, aquela sensação de conexão instantânea.</w:t>
+            </w:r>
+          </w:p>
+          <w:p>
+            <w:pPr>
+              <w:spacing w:after="160" w:before="40"/>
+              <w:shd w:val="clear" w:fill="FBEEF7"/>
+              <w:pBdr>
+                <w:top w:val="single" w:sz="6" w:space="4" w:color="D9D9D9"/>
+                <w:left w:val="single" w:sz="6" w:space="4" w:color="D9D9D9"/>
+                <w:bottom w:val="single" w:sz="6" w:space="4" w:color="D9D9D9"/>
+                <w:right w:val="single" w:sz="6" w:space="4" w:color="D9D9D9"/>
+              </w:pBdr>
+            </w:pPr>
+            <w:r>
+              <w:rPr>
+                <w:b/>
+                <w:i w:val="0"/>
+                <w:color w:val="666666"/>
+                <w:sz w:val="18"/>
+              </w:rPr>
+              <w:t>TRECHO 4</w:t>
+            </w:r>
+            <w:r>
+              <w:br/>
+            </w:r>
+            <w:r>
+              <w:rPr>
+                <w:b w:val="0"/>
+                <w:i w:val="0"/>
+                <w:sz w:val="19"/>
+              </w:rPr>
+              <w:t>Só que, assim que a relação começa a ficar séria de verdade, alguma coisa dispara internamente um alarme de perigo. E, ao invés de falar sobre isso, a pessoa evita, se afasta, ou simplesmente some.</w:t>
+            </w:r>
+          </w:p>
+          <w:p>
+            <w:pPr>
+              <w:spacing w:after="160" w:before="40"/>
+              <w:shd w:val="clear" w:fill="FBEEF7"/>
+              <w:pBdr>
+                <w:top w:val="single" w:sz="6" w:space="4" w:color="D9D9D9"/>
+                <w:left w:val="single" w:sz="6" w:space="4" w:color="D9D9D9"/>
+                <w:bottom w:val="single" w:sz="6" w:space="4" w:color="D9D9D9"/>
+                <w:right w:val="single" w:sz="6" w:space="4" w:color="D9D9D9"/>
+              </w:pBdr>
+            </w:pPr>
+            <w:r>
+              <w:rPr>
+                <w:b/>
+                <w:i w:val="0"/>
+                <w:color w:val="666666"/>
+                <w:sz w:val="18"/>
+              </w:rPr>
+              <w:t>TRECHO 5</w:t>
+            </w:r>
+            <w:r>
+              <w:br/>
+            </w:r>
+            <w:r>
+              <w:rPr>
+                <w:b w:val="0"/>
+                <w:i w:val="0"/>
+                <w:sz w:val="19"/>
+              </w:rPr>
+              <w:t>Não é sobre falta de interesse, na maioria das vezes. É medo de intimidade, de depender de alguém, de ser vista de verdade e, quem sabe, magoada depois.</w:t>
+            </w:r>
+          </w:p>
+          <w:p>
+            <w:pPr>
+              <w:spacing w:after="160" w:before="40"/>
+              <w:shd w:val="clear" w:fill="FBEEF7"/>
+              <w:pBdr>
+                <w:top w:val="single" w:sz="6" w:space="4" w:color="D9D9D9"/>
+                <w:left w:val="single" w:sz="6" w:space="4" w:color="D9D9D9"/>
+                <w:bottom w:val="single" w:sz="6" w:space="4" w:color="D9D9D9"/>
+                <w:right w:val="single" w:sz="6" w:space="4" w:color="D9D9D9"/>
+              </w:pBdr>
+            </w:pPr>
+            <w:r>
+              <w:rPr>
+                <w:b/>
+                <w:i w:val="0"/>
+                <w:color w:val="666666"/>
+                <w:sz w:val="18"/>
+              </w:rPr>
+              <w:t>TRECHO 6</w:t>
+            </w:r>
+            <w:r>
+              <w:br/>
+            </w:r>
+            <w:r>
+              <w:rPr>
+                <w:b w:val="0"/>
+                <w:i w:val="0"/>
+                <w:sz w:val="19"/>
+              </w:rPr>
+              <w:t>E para quem está do outro lado, isso dói duas vezes: primeiro pelo sumiço em si, segundo por não entender o que aconteceu, o que geralmente leva a procurar defeito em si mesma, quando na verdade era um padrão do outro se manifestando.</w:t>
+            </w:r>
+          </w:p>
+          <w:p>
+            <w:pPr>
+              <w:spacing w:after="160" w:before="40"/>
+              <w:shd w:val="clear" w:fill="FBEEF7"/>
+              <w:pBdr>
+                <w:top w:val="single" w:sz="6" w:space="4" w:color="D9D9D9"/>
+                <w:left w:val="single" w:sz="6" w:space="4" w:color="D9D9D9"/>
+                <w:bottom w:val="single" w:sz="6" w:space="4" w:color="D9D9D9"/>
+                <w:right w:val="single" w:sz="6" w:space="4" w:color="D9D9D9"/>
+              </w:pBdr>
+            </w:pPr>
+            <w:r>
+              <w:rPr>
+                <w:b/>
+                <w:i w:val="0"/>
+                <w:color w:val="666666"/>
+                <w:sz w:val="18"/>
+              </w:rPr>
+              <w:t>TRECHO 7</w:t>
+            </w:r>
+            <w:r>
+              <w:br/>
+            </w:r>
+            <w:r>
+              <w:rPr>
+                <w:b w:val="0"/>
+                <w:i w:val="0"/>
+                <w:sz w:val="19"/>
+              </w:rPr>
+              <w:t>Entender esse padrão, seja no outro ou em você mesma, muda completamente a forma de lidar com relações assim, ou até de reconhecer os primeiros sinais antes de se machucar de novo.</w:t>
             </w:r>
           </w:p>
           <w:p>

</xml_diff>